<commit_message>
Local Docker start scripts, Gmail allow-list, COOKIE_SECURE for http testing, DigitalOcean deploy notes, plan v2
</commit_message>
<xml_diff>
--- a/docs/Tradelog_Project_Docs.docx
+++ b/docs/Tradelog_Project_Docs.docx
@@ -43,7 +43,7 @@
           <w:sz w:val="20"/>
           <w:szCs w:val="20"/>
         </w:rPr>
-        <w:t xml:space="preserve">Version v1  |  2026-10-20  |  Owner: Santosh Krishna</w:t>
+        <w:t xml:space="preserve">Version v2  |  2026-10-20  |  Owner: Santosh Krishna</w:t>
       </w:r>
     </w:p>
     <w:p>
@@ -24763,7 +24763,7 @@
                 <w:sz w:val="20"/>
                 <w:szCs w:val="20"/>
               </w:rPr>
-              <w:t xml:space="preserve">v1</w:t>
+              <w:t xml:space="preserve">v2</w:t>
             </w:r>
           </w:p>
         </w:tc>
@@ -27201,7 +27201,7 @@
                 <w:sz w:val="20"/>
                 <w:szCs w:val="20"/>
               </w:rPr>
-              <w:t xml:space="preserve">Add both Google addresses as test users</w:t>
+              <w:t xml:space="preserve">Add both Gmail addresses as test users; register http://localhost:8080/auth/google/callback first</w:t>
             </w:r>
           </w:p>
         </w:tc>
@@ -27451,7 +27451,7 @@
                 <w:sz w:val="20"/>
                 <w:szCs w:val="20"/>
               </w:rPr>
-              <w:t xml:space="preserve">—</w:t>
+              <w:t xml:space="preserve">2026-10-20</w:t>
             </w:r>
           </w:p>
         </w:tc>
@@ -27482,7 +27482,7 @@
                 <w:sz w:val="20"/>
                 <w:szCs w:val="20"/>
               </w:rPr>
-              <w:t xml:space="preserve">—</w:t>
+              <w:t xml:space="preserve">2026-10-20</w:t>
             </w:r>
           </w:p>
         </w:tc>
@@ -27513,7 +27513,7 @@
                 <w:sz w:val="20"/>
                 <w:szCs w:val="20"/>
               </w:rPr>
-              <w:t xml:space="preserve">Not Started</w:t>
+              <w:t xml:space="preserve">Done</w:t>
             </w:r>
           </w:p>
         </w:tc>
@@ -27544,7 +27544,7 @@
                 <w:sz w:val="20"/>
                 <w:szCs w:val="20"/>
               </w:rPr>
-              <w:t xml:space="preserve">TBD — Anil's Google address; is Santosh's santosh.krishna@cattlexpert.com?</w:t>
+              <w:t xml:space="preserve">santosh.krishna0909@gmail.com (anilsub02), mailanilkumar@gmail.com (anilsub01)</w:t>
             </w:r>
           </w:p>
         </w:tc>
@@ -28894,7 +28894,7 @@
                 <w:sz w:val="20"/>
                 <w:szCs w:val="20"/>
               </w:rPr>
-              <w:t xml:space="preserve">If not, add a second pair of query IDs</w:t>
+              <w:t xml:space="preserve">Santosh will configure both queries to cover both accounts</w:t>
             </w:r>
           </w:p>
         </w:tc>
@@ -30486,7 +30486,7 @@
                 <w:sz w:val="20"/>
                 <w:szCs w:val="20"/>
               </w:rPr>
-              <w:t xml:space="preserve">—</w:t>
+              <w:t xml:space="preserve">2026-10-20</w:t>
             </w:r>
           </w:p>
         </w:tc>
@@ -30516,7 +30516,7 @@
                 <w:sz w:val="20"/>
                 <w:szCs w:val="20"/>
               </w:rPr>
-              <w:t xml:space="preserve">—</w:t>
+              <w:t xml:space="preserve">2026-10-20</w:t>
             </w:r>
           </w:p>
         </w:tc>
@@ -30546,7 +30546,7 @@
                 <w:sz w:val="20"/>
                 <w:szCs w:val="20"/>
               </w:rPr>
-              <w:t xml:space="preserve">Not Started</w:t>
+              <w:t xml:space="preserve">Done</w:t>
             </w:r>
           </w:p>
         </w:tc>
@@ -30576,7 +30576,7 @@
                 <w:sz w:val="20"/>
                 <w:szCs w:val="20"/>
               </w:rPr>
-              <w:t xml:space="preserve">Defaults $50 scratch, $500 big; loss limit unset</w:t>
+              <w:t xml:space="preserve">Defaults kept: $50 scratch, $500 big, starter rules, loss limit unset</w:t>
             </w:r>
           </w:p>
         </w:tc>
@@ -31346,7 +31346,7 @@
                 <w:sz w:val="20"/>
                 <w:szCs w:val="20"/>
               </w:rPr>
-              <w:t xml:space="preserve">One week of live trades reconciled to IBKR</w:t>
+              <w:t xml:space="preserve">One-command local Docker start (local-up scripts)</w:t>
             </w:r>
           </w:p>
         </w:tc>
@@ -31377,7 +31377,7 @@
                 <w:sz w:val="20"/>
                 <w:szCs w:val="20"/>
               </w:rPr>
-              <w:t xml:space="preserve">Santosh, Anil</w:t>
+              <w:t xml:space="preserve">AI Agent</w:t>
             </w:r>
           </w:p>
         </w:tc>
@@ -31408,7 +31408,7 @@
                 <w:sz w:val="20"/>
                 <w:szCs w:val="20"/>
               </w:rPr>
-              <w:t xml:space="preserve">5d</w:t>
+              <w:t xml:space="preserve">0.5d</w:t>
             </w:r>
           </w:p>
         </w:tc>
@@ -31439,7 +31439,7 @@
                 <w:sz w:val="20"/>
                 <w:szCs w:val="20"/>
               </w:rPr>
-              <w:t xml:space="preserve">2026-10-26</w:t>
+              <w:t xml:space="preserve">2026-10-20</w:t>
             </w:r>
           </w:p>
         </w:tc>
@@ -31470,7 +31470,7 @@
                 <w:sz w:val="20"/>
                 <w:szCs w:val="20"/>
               </w:rPr>
-              <w:t xml:space="preserve">2026-10-30</w:t>
+              <w:t xml:space="preserve">2026-10-20</w:t>
             </w:r>
           </w:p>
         </w:tc>
@@ -31501,7 +31501,7 @@
                 <w:sz w:val="20"/>
                 <w:szCs w:val="20"/>
               </w:rPr>
-              <w:t xml:space="preserve">—</w:t>
+              <w:t xml:space="preserve">2026-10-20</w:t>
             </w:r>
           </w:p>
         </w:tc>
@@ -31532,7 +31532,7 @@
                 <w:sz w:val="20"/>
                 <w:szCs w:val="20"/>
               </w:rPr>
-              <w:t xml:space="preserve">—</w:t>
+              <w:t xml:space="preserve">2026-10-20</w:t>
             </w:r>
           </w:p>
         </w:tc>
@@ -31563,7 +31563,7 @@
                 <w:sz w:val="20"/>
                 <w:szCs w:val="20"/>
               </w:rPr>
-              <w:t xml:space="preserve">Not Started</w:t>
+              <w:t xml:space="preserve">Done</w:t>
             </w:r>
           </w:p>
         </w:tc>
@@ -31594,7 +31594,7 @@
                 <w:sz w:val="20"/>
                 <w:szCs w:val="20"/>
               </w:rPr>
-              <w:t xml:space="preserve">Needs Deploy done first</w:t>
+              <w:t xml:space="preserve">Added in v2; images and script verified in workspace</w:t>
             </w:r>
           </w:p>
         </w:tc>
@@ -31626,7 +31626,7 @@
                 <w:sz w:val="20"/>
                 <w:szCs w:val="20"/>
               </w:rPr>
-              <w:t xml:space="preserve">12</w:t>
+              <w:t xml:space="preserve">11</w:t>
             </w:r>
           </w:p>
         </w:tc>
@@ -31656,7 +31656,7 @@
                 <w:sz w:val="20"/>
                 <w:szCs w:val="20"/>
               </w:rPr>
-              <w:t xml:space="preserve">Deploy</w:t>
+              <w:t xml:space="preserve">Testing</w:t>
             </w:r>
           </w:p>
         </w:tc>
@@ -31686,7 +31686,7 @@
                 <w:sz w:val="20"/>
                 <w:szCs w:val="20"/>
               </w:rPr>
-              <w:t xml:space="preserve">Choose host and provision server with static IP</w:t>
+              <w:t xml:space="preserve">Test locally on Docker Desktop</w:t>
             </w:r>
           </w:p>
         </w:tc>
@@ -31776,7 +31776,7 @@
                 <w:sz w:val="20"/>
                 <w:szCs w:val="20"/>
               </w:rPr>
-              <w:t xml:space="preserve">2026-10-22</w:t>
+              <w:t xml:space="preserve">2026-10-21</w:t>
             </w:r>
           </w:p>
         </w:tc>
@@ -31806,7 +31806,7 @@
                 <w:sz w:val="20"/>
                 <w:szCs w:val="20"/>
               </w:rPr>
-              <w:t xml:space="preserve">2026-10-22</w:t>
+              <w:t xml:space="preserve">2026-10-21</w:t>
             </w:r>
           </w:p>
         </w:tc>
@@ -31926,7 +31926,7 @@
                 <w:sz w:val="20"/>
                 <w:szCs w:val="20"/>
               </w:rPr>
-              <w:t xml:space="preserve">TBD — OVH, Azure or new VPS? Domain?</w:t>
+              <w:t xml:space="preserve">Added in v2; run scripts/local-up with --demo, then --reset before real imports</w:t>
             </w:r>
           </w:p>
         </w:tc>
@@ -31959,6 +31959,348 @@
                 <w:sz w:val="20"/>
                 <w:szCs w:val="20"/>
               </w:rPr>
+              <w:t xml:space="preserve">11</w:t>
+            </w:r>
+          </w:p>
+        </w:tc>
+        <w:tc>
+          <w:tcPr>
+            <w:tcW w:type="dxa" w:w="1074"/>
+            <w:tcBorders>
+              <w:top w:val="single" w:color="B7C1CD" w:sz="4"/>
+              <w:left w:val="single" w:color="B7C1CD" w:sz="4"/>
+              <w:bottom w:val="single" w:color="B7C1CD" w:sz="4"/>
+              <w:right w:val="single" w:color="B7C1CD" w:sz="4"/>
+            </w:tcBorders>
+            <w:shd w:fill="F6F8FA" w:color="auto" w:val="clear"/>
+            <w:tcMar>
+              <w:top w:type="dxa" w:w="60"/>
+              <w:left w:type="dxa" w:w="100"/>
+              <w:bottom w:type="dxa" w:w="60"/>
+              <w:right w:type="dxa" w:w="100"/>
+            </w:tcMar>
+          </w:tcPr>
+          <w:p>
+            <w:pPr>
+              <w:spacing w:after="40"/>
+            </w:pPr>
+            <w:r>
+              <w:rPr>
+                <w:rFonts w:ascii="Calibri" w:cs="Calibri" w:eastAsia="Calibri" w:hAnsi="Calibri"/>
+                <w:sz w:val="20"/>
+                <w:szCs w:val="20"/>
+              </w:rPr>
+              <w:t xml:space="preserve">Testing</w:t>
+            </w:r>
+          </w:p>
+        </w:tc>
+        <w:tc>
+          <w:tcPr>
+            <w:tcW w:type="dxa" w:w="2247"/>
+            <w:tcBorders>
+              <w:top w:val="single" w:color="B7C1CD" w:sz="4"/>
+              <w:left w:val="single" w:color="B7C1CD" w:sz="4"/>
+              <w:bottom w:val="single" w:color="B7C1CD" w:sz="4"/>
+              <w:right w:val="single" w:color="B7C1CD" w:sz="4"/>
+            </w:tcBorders>
+            <w:shd w:fill="F6F8FA" w:color="auto" w:val="clear"/>
+            <w:tcMar>
+              <w:top w:type="dxa" w:w="60"/>
+              <w:left w:type="dxa" w:w="100"/>
+              <w:bottom w:type="dxa" w:w="60"/>
+              <w:right w:type="dxa" w:w="100"/>
+            </w:tcMar>
+          </w:tcPr>
+          <w:p>
+            <w:pPr>
+              <w:spacing w:after="40"/>
+            </w:pPr>
+            <w:r>
+              <w:rPr>
+                <w:rFonts w:ascii="Calibri" w:cs="Calibri" w:eastAsia="Calibri" w:hAnsi="Calibri"/>
+                <w:sz w:val="20"/>
+                <w:szCs w:val="20"/>
+              </w:rPr>
+              <w:t xml:space="preserve">One week of live trades reconciled to IBKR</w:t>
+            </w:r>
+          </w:p>
+        </w:tc>
+        <w:tc>
+          <w:tcPr>
+            <w:tcW w:type="dxa" w:w="977"/>
+            <w:tcBorders>
+              <w:top w:val="single" w:color="B7C1CD" w:sz="4"/>
+              <w:left w:val="single" w:color="B7C1CD" w:sz="4"/>
+              <w:bottom w:val="single" w:color="B7C1CD" w:sz="4"/>
+              <w:right w:val="single" w:color="B7C1CD" w:sz="4"/>
+            </w:tcBorders>
+            <w:shd w:fill="F6F8FA" w:color="auto" w:val="clear"/>
+            <w:tcMar>
+              <w:top w:type="dxa" w:w="60"/>
+              <w:left w:type="dxa" w:w="100"/>
+              <w:bottom w:type="dxa" w:w="60"/>
+              <w:right w:type="dxa" w:w="100"/>
+            </w:tcMar>
+          </w:tcPr>
+          <w:p>
+            <w:pPr>
+              <w:spacing w:after="40"/>
+            </w:pPr>
+            <w:r>
+              <w:rPr>
+                <w:rFonts w:ascii="Calibri" w:cs="Calibri" w:eastAsia="Calibri" w:hAnsi="Calibri"/>
+                <w:sz w:val="20"/>
+                <w:szCs w:val="20"/>
+              </w:rPr>
+              <w:t xml:space="preserve">Santosh, Anil</w:t>
+            </w:r>
+          </w:p>
+        </w:tc>
+        <w:tc>
+          <w:tcPr>
+            <w:tcW w:type="dxa" w:w="830"/>
+            <w:tcBorders>
+              <w:top w:val="single" w:color="B7C1CD" w:sz="4"/>
+              <w:left w:val="single" w:color="B7C1CD" w:sz="4"/>
+              <w:bottom w:val="single" w:color="B7C1CD" w:sz="4"/>
+              <w:right w:val="single" w:color="B7C1CD" w:sz="4"/>
+            </w:tcBorders>
+            <w:shd w:fill="F6F8FA" w:color="auto" w:val="clear"/>
+            <w:tcMar>
+              <w:top w:type="dxa" w:w="60"/>
+              <w:left w:type="dxa" w:w="100"/>
+              <w:bottom w:type="dxa" w:w="60"/>
+              <w:right w:type="dxa" w:w="100"/>
+            </w:tcMar>
+          </w:tcPr>
+          <w:p>
+            <w:pPr>
+              <w:spacing w:after="40"/>
+            </w:pPr>
+            <w:r>
+              <w:rPr>
+                <w:rFonts w:ascii="Calibri" w:cs="Calibri" w:eastAsia="Calibri" w:hAnsi="Calibri"/>
+                <w:sz w:val="20"/>
+                <w:szCs w:val="20"/>
+              </w:rPr>
+              <w:t xml:space="preserve">5d</w:t>
+            </w:r>
+          </w:p>
+        </w:tc>
+        <w:tc>
+          <w:tcPr>
+            <w:tcW w:type="dxa" w:w="1172"/>
+            <w:tcBorders>
+              <w:top w:val="single" w:color="B7C1CD" w:sz="4"/>
+              <w:left w:val="single" w:color="B7C1CD" w:sz="4"/>
+              <w:bottom w:val="single" w:color="B7C1CD" w:sz="4"/>
+              <w:right w:val="single" w:color="B7C1CD" w:sz="4"/>
+            </w:tcBorders>
+            <w:shd w:fill="F6F8FA" w:color="auto" w:val="clear"/>
+            <w:tcMar>
+              <w:top w:type="dxa" w:w="60"/>
+              <w:left w:type="dxa" w:w="100"/>
+              <w:bottom w:type="dxa" w:w="60"/>
+              <w:right w:type="dxa" w:w="100"/>
+            </w:tcMar>
+          </w:tcPr>
+          <w:p>
+            <w:pPr>
+              <w:spacing w:after="40"/>
+            </w:pPr>
+            <w:r>
+              <w:rPr>
+                <w:rFonts w:ascii="Calibri" w:cs="Calibri" w:eastAsia="Calibri" w:hAnsi="Calibri"/>
+                <w:sz w:val="20"/>
+                <w:szCs w:val="20"/>
+              </w:rPr>
+              <w:t xml:space="preserve">2026-10-26</w:t>
+            </w:r>
+          </w:p>
+        </w:tc>
+        <w:tc>
+          <w:tcPr>
+            <w:tcW w:type="dxa" w:w="1172"/>
+            <w:tcBorders>
+              <w:top w:val="single" w:color="B7C1CD" w:sz="4"/>
+              <w:left w:val="single" w:color="B7C1CD" w:sz="4"/>
+              <w:bottom w:val="single" w:color="B7C1CD" w:sz="4"/>
+              <w:right w:val="single" w:color="B7C1CD" w:sz="4"/>
+            </w:tcBorders>
+            <w:shd w:fill="F6F8FA" w:color="auto" w:val="clear"/>
+            <w:tcMar>
+              <w:top w:type="dxa" w:w="60"/>
+              <w:left w:type="dxa" w:w="100"/>
+              <w:bottom w:type="dxa" w:w="60"/>
+              <w:right w:type="dxa" w:w="100"/>
+            </w:tcMar>
+          </w:tcPr>
+          <w:p>
+            <w:pPr>
+              <w:spacing w:after="40"/>
+            </w:pPr>
+            <w:r>
+              <w:rPr>
+                <w:rFonts w:ascii="Calibri" w:cs="Calibri" w:eastAsia="Calibri" w:hAnsi="Calibri"/>
+                <w:sz w:val="20"/>
+                <w:szCs w:val="20"/>
+              </w:rPr>
+              <w:t xml:space="preserve">2026-10-30</w:t>
+            </w:r>
+          </w:p>
+        </w:tc>
+        <w:tc>
+          <w:tcPr>
+            <w:tcW w:type="dxa" w:w="1172"/>
+            <w:tcBorders>
+              <w:top w:val="single" w:color="B7C1CD" w:sz="4"/>
+              <w:left w:val="single" w:color="B7C1CD" w:sz="4"/>
+              <w:bottom w:val="single" w:color="B7C1CD" w:sz="4"/>
+              <w:right w:val="single" w:color="B7C1CD" w:sz="4"/>
+            </w:tcBorders>
+            <w:shd w:fill="F6F8FA" w:color="auto" w:val="clear"/>
+            <w:tcMar>
+              <w:top w:type="dxa" w:w="60"/>
+              <w:left w:type="dxa" w:w="100"/>
+              <w:bottom w:type="dxa" w:w="60"/>
+              <w:right w:type="dxa" w:w="100"/>
+            </w:tcMar>
+          </w:tcPr>
+          <w:p>
+            <w:pPr>
+              <w:spacing w:after="40"/>
+            </w:pPr>
+            <w:r>
+              <w:rPr>
+                <w:rFonts w:ascii="Calibri" w:cs="Calibri" w:eastAsia="Calibri" w:hAnsi="Calibri"/>
+                <w:sz w:val="20"/>
+                <w:szCs w:val="20"/>
+              </w:rPr>
+              <w:t xml:space="preserve">—</w:t>
+            </w:r>
+          </w:p>
+        </w:tc>
+        <w:tc>
+          <w:tcPr>
+            <w:tcW w:type="dxa" w:w="1172"/>
+            <w:tcBorders>
+              <w:top w:val="single" w:color="B7C1CD" w:sz="4"/>
+              <w:left w:val="single" w:color="B7C1CD" w:sz="4"/>
+              <w:bottom w:val="single" w:color="B7C1CD" w:sz="4"/>
+              <w:right w:val="single" w:color="B7C1CD" w:sz="4"/>
+            </w:tcBorders>
+            <w:shd w:fill="F6F8FA" w:color="auto" w:val="clear"/>
+            <w:tcMar>
+              <w:top w:type="dxa" w:w="60"/>
+              <w:left w:type="dxa" w:w="100"/>
+              <w:bottom w:type="dxa" w:w="60"/>
+              <w:right w:type="dxa" w:w="100"/>
+            </w:tcMar>
+          </w:tcPr>
+          <w:p>
+            <w:pPr>
+              <w:spacing w:after="40"/>
+            </w:pPr>
+            <w:r>
+              <w:rPr>
+                <w:rFonts w:ascii="Calibri" w:cs="Calibri" w:eastAsia="Calibri" w:hAnsi="Calibri"/>
+                <w:sz w:val="20"/>
+                <w:szCs w:val="20"/>
+              </w:rPr>
+              <w:t xml:space="preserve">—</w:t>
+            </w:r>
+          </w:p>
+        </w:tc>
+        <w:tc>
+          <w:tcPr>
+            <w:tcW w:type="dxa" w:w="977"/>
+            <w:tcBorders>
+              <w:top w:val="single" w:color="B7C1CD" w:sz="4"/>
+              <w:left w:val="single" w:color="B7C1CD" w:sz="4"/>
+              <w:bottom w:val="single" w:color="B7C1CD" w:sz="4"/>
+              <w:right w:val="single" w:color="B7C1CD" w:sz="4"/>
+            </w:tcBorders>
+            <w:shd w:fill="F6F8FA" w:color="auto" w:val="clear"/>
+            <w:tcMar>
+              <w:top w:type="dxa" w:w="60"/>
+              <w:left w:type="dxa" w:w="100"/>
+              <w:bottom w:type="dxa" w:w="60"/>
+              <w:right w:type="dxa" w:w="100"/>
+            </w:tcMar>
+          </w:tcPr>
+          <w:p>
+            <w:pPr>
+              <w:spacing w:after="40"/>
+            </w:pPr>
+            <w:r>
+              <w:rPr>
+                <w:rFonts w:ascii="Calibri" w:cs="Calibri" w:eastAsia="Calibri" w:hAnsi="Calibri"/>
+                <w:sz w:val="20"/>
+                <w:szCs w:val="20"/>
+              </w:rPr>
+              <w:t xml:space="preserve">Not Started</w:t>
+            </w:r>
+          </w:p>
+        </w:tc>
+        <w:tc>
+          <w:tcPr>
+            <w:tcW w:type="dxa" w:w="2155"/>
+            <w:tcBorders>
+              <w:top w:val="single" w:color="B7C1CD" w:sz="4"/>
+              <w:left w:val="single" w:color="B7C1CD" w:sz="4"/>
+              <w:bottom w:val="single" w:color="B7C1CD" w:sz="4"/>
+              <w:right w:val="single" w:color="B7C1CD" w:sz="4"/>
+            </w:tcBorders>
+            <w:shd w:fill="F6F8FA" w:color="auto" w:val="clear"/>
+            <w:tcMar>
+              <w:top w:type="dxa" w:w="60"/>
+              <w:left w:type="dxa" w:w="100"/>
+              <w:bottom w:type="dxa" w:w="60"/>
+              <w:right w:type="dxa" w:w="100"/>
+            </w:tcMar>
+          </w:tcPr>
+          <w:p>
+            <w:pPr>
+              <w:spacing w:after="40"/>
+            </w:pPr>
+            <w:r>
+              <w:rPr>
+                <w:rFonts w:ascii="Calibri" w:cs="Calibri" w:eastAsia="Calibri" w:hAnsi="Calibri"/>
+                <w:sz w:val="20"/>
+                <w:szCs w:val="20"/>
+              </w:rPr>
+              <w:t xml:space="preserve">Needs Deploy done first</w:t>
+            </w:r>
+          </w:p>
+        </w:tc>
+      </w:tr>
+      <w:tr>
+        <w:tc>
+          <w:tcPr>
+            <w:tcW w:type="dxa" w:w="732"/>
+            <w:tcBorders>
+              <w:top w:val="single" w:color="B7C1CD" w:sz="4"/>
+              <w:left w:val="single" w:color="B7C1CD" w:sz="4"/>
+              <w:bottom w:val="single" w:color="B7C1CD" w:sz="4"/>
+              <w:right w:val="single" w:color="B7C1CD" w:sz="4"/>
+            </w:tcBorders>
+            <w:tcMar>
+              <w:top w:type="dxa" w:w="60"/>
+              <w:left w:type="dxa" w:w="100"/>
+              <w:bottom w:type="dxa" w:w="60"/>
+              <w:right w:type="dxa" w:w="100"/>
+            </w:tcMar>
+          </w:tcPr>
+          <w:p>
+            <w:pPr>
+              <w:spacing w:after="40"/>
+            </w:pPr>
+            <w:r>
+              <w:rPr>
+                <w:rFonts w:ascii="Calibri" w:cs="Calibri" w:eastAsia="Calibri" w:hAnsi="Calibri"/>
+                <w:sz w:val="20"/>
+                <w:szCs w:val="20"/>
+              </w:rPr>
               <w:t xml:space="preserve">12</w:t>
             </w:r>
           </w:p>
@@ -31972,7 +32314,6 @@
               <w:bottom w:val="single" w:color="B7C1CD" w:sz="4"/>
               <w:right w:val="single" w:color="B7C1CD" w:sz="4"/>
             </w:tcBorders>
-            <w:shd w:fill="F6F8FA" w:color="auto" w:val="clear"/>
             <w:tcMar>
               <w:top w:type="dxa" w:w="60"/>
               <w:left w:type="dxa" w:w="100"/>
@@ -32003,6 +32344,340 @@
               <w:bottom w:val="single" w:color="B7C1CD" w:sz="4"/>
               <w:right w:val="single" w:color="B7C1CD" w:sz="4"/>
             </w:tcBorders>
+            <w:tcMar>
+              <w:top w:type="dxa" w:w="60"/>
+              <w:left w:type="dxa" w:w="100"/>
+              <w:bottom w:type="dxa" w:w="60"/>
+              <w:right w:type="dxa" w:w="100"/>
+            </w:tcMar>
+          </w:tcPr>
+          <w:p>
+            <w:pPr>
+              <w:spacing w:after="40"/>
+            </w:pPr>
+            <w:r>
+              <w:rPr>
+                <w:rFonts w:ascii="Calibri" w:cs="Calibri" w:eastAsia="Calibri" w:hAnsi="Calibri"/>
+                <w:sz w:val="20"/>
+                <w:szCs w:val="20"/>
+              </w:rPr>
+              <w:t xml:space="preserve">Choose host and provision server with static IP</w:t>
+            </w:r>
+          </w:p>
+        </w:tc>
+        <w:tc>
+          <w:tcPr>
+            <w:tcW w:type="dxa" w:w="977"/>
+            <w:tcBorders>
+              <w:top w:val="single" w:color="B7C1CD" w:sz="4"/>
+              <w:left w:val="single" w:color="B7C1CD" w:sz="4"/>
+              <w:bottom w:val="single" w:color="B7C1CD" w:sz="4"/>
+              <w:right w:val="single" w:color="B7C1CD" w:sz="4"/>
+            </w:tcBorders>
+            <w:tcMar>
+              <w:top w:type="dxa" w:w="60"/>
+              <w:left w:type="dxa" w:w="100"/>
+              <w:bottom w:type="dxa" w:w="60"/>
+              <w:right w:type="dxa" w:w="100"/>
+            </w:tcMar>
+          </w:tcPr>
+          <w:p>
+            <w:pPr>
+              <w:spacing w:after="40"/>
+            </w:pPr>
+            <w:r>
+              <w:rPr>
+                <w:rFonts w:ascii="Calibri" w:cs="Calibri" w:eastAsia="Calibri" w:hAnsi="Calibri"/>
+                <w:sz w:val="20"/>
+                <w:szCs w:val="20"/>
+              </w:rPr>
+              <w:t xml:space="preserve">Santosh</w:t>
+            </w:r>
+          </w:p>
+        </w:tc>
+        <w:tc>
+          <w:tcPr>
+            <w:tcW w:type="dxa" w:w="830"/>
+            <w:tcBorders>
+              <w:top w:val="single" w:color="B7C1CD" w:sz="4"/>
+              <w:left w:val="single" w:color="B7C1CD" w:sz="4"/>
+              <w:bottom w:val="single" w:color="B7C1CD" w:sz="4"/>
+              <w:right w:val="single" w:color="B7C1CD" w:sz="4"/>
+            </w:tcBorders>
+            <w:tcMar>
+              <w:top w:type="dxa" w:w="60"/>
+              <w:left w:type="dxa" w:w="100"/>
+              <w:bottom w:type="dxa" w:w="60"/>
+              <w:right w:type="dxa" w:w="100"/>
+            </w:tcMar>
+          </w:tcPr>
+          <w:p>
+            <w:pPr>
+              <w:spacing w:after="40"/>
+            </w:pPr>
+            <w:r>
+              <w:rPr>
+                <w:rFonts w:ascii="Calibri" w:cs="Calibri" w:eastAsia="Calibri" w:hAnsi="Calibri"/>
+                <w:sz w:val="20"/>
+                <w:szCs w:val="20"/>
+              </w:rPr>
+              <w:t xml:space="preserve">1d</w:t>
+            </w:r>
+          </w:p>
+        </w:tc>
+        <w:tc>
+          <w:tcPr>
+            <w:tcW w:type="dxa" w:w="1172"/>
+            <w:tcBorders>
+              <w:top w:val="single" w:color="B7C1CD" w:sz="4"/>
+              <w:left w:val="single" w:color="B7C1CD" w:sz="4"/>
+              <w:bottom w:val="single" w:color="B7C1CD" w:sz="4"/>
+              <w:right w:val="single" w:color="B7C1CD" w:sz="4"/>
+            </w:tcBorders>
+            <w:tcMar>
+              <w:top w:type="dxa" w:w="60"/>
+              <w:left w:type="dxa" w:w="100"/>
+              <w:bottom w:type="dxa" w:w="60"/>
+              <w:right w:type="dxa" w:w="100"/>
+            </w:tcMar>
+          </w:tcPr>
+          <w:p>
+            <w:pPr>
+              <w:spacing w:after="40"/>
+            </w:pPr>
+            <w:r>
+              <w:rPr>
+                <w:rFonts w:ascii="Calibri" w:cs="Calibri" w:eastAsia="Calibri" w:hAnsi="Calibri"/>
+                <w:sz w:val="20"/>
+                <w:szCs w:val="20"/>
+              </w:rPr>
+              <w:t xml:space="preserve">2026-10-22</w:t>
+            </w:r>
+          </w:p>
+        </w:tc>
+        <w:tc>
+          <w:tcPr>
+            <w:tcW w:type="dxa" w:w="1172"/>
+            <w:tcBorders>
+              <w:top w:val="single" w:color="B7C1CD" w:sz="4"/>
+              <w:left w:val="single" w:color="B7C1CD" w:sz="4"/>
+              <w:bottom w:val="single" w:color="B7C1CD" w:sz="4"/>
+              <w:right w:val="single" w:color="B7C1CD" w:sz="4"/>
+            </w:tcBorders>
+            <w:tcMar>
+              <w:top w:type="dxa" w:w="60"/>
+              <w:left w:type="dxa" w:w="100"/>
+              <w:bottom w:type="dxa" w:w="60"/>
+              <w:right w:type="dxa" w:w="100"/>
+            </w:tcMar>
+          </w:tcPr>
+          <w:p>
+            <w:pPr>
+              <w:spacing w:after="40"/>
+            </w:pPr>
+            <w:r>
+              <w:rPr>
+                <w:rFonts w:ascii="Calibri" w:cs="Calibri" w:eastAsia="Calibri" w:hAnsi="Calibri"/>
+                <w:sz w:val="20"/>
+                <w:szCs w:val="20"/>
+              </w:rPr>
+              <w:t xml:space="preserve">2026-10-22</w:t>
+            </w:r>
+          </w:p>
+        </w:tc>
+        <w:tc>
+          <w:tcPr>
+            <w:tcW w:type="dxa" w:w="1172"/>
+            <w:tcBorders>
+              <w:top w:val="single" w:color="B7C1CD" w:sz="4"/>
+              <w:left w:val="single" w:color="B7C1CD" w:sz="4"/>
+              <w:bottom w:val="single" w:color="B7C1CD" w:sz="4"/>
+              <w:right w:val="single" w:color="B7C1CD" w:sz="4"/>
+            </w:tcBorders>
+            <w:tcMar>
+              <w:top w:type="dxa" w:w="60"/>
+              <w:left w:type="dxa" w:w="100"/>
+              <w:bottom w:type="dxa" w:w="60"/>
+              <w:right w:type="dxa" w:w="100"/>
+            </w:tcMar>
+          </w:tcPr>
+          <w:p>
+            <w:pPr>
+              <w:spacing w:after="40"/>
+            </w:pPr>
+            <w:r>
+              <w:rPr>
+                <w:rFonts w:ascii="Calibri" w:cs="Calibri" w:eastAsia="Calibri" w:hAnsi="Calibri"/>
+                <w:sz w:val="20"/>
+                <w:szCs w:val="20"/>
+              </w:rPr>
+              <w:t xml:space="preserve">2026-10-20</w:t>
+            </w:r>
+          </w:p>
+        </w:tc>
+        <w:tc>
+          <w:tcPr>
+            <w:tcW w:type="dxa" w:w="1172"/>
+            <w:tcBorders>
+              <w:top w:val="single" w:color="B7C1CD" w:sz="4"/>
+              <w:left w:val="single" w:color="B7C1CD" w:sz="4"/>
+              <w:bottom w:val="single" w:color="B7C1CD" w:sz="4"/>
+              <w:right w:val="single" w:color="B7C1CD" w:sz="4"/>
+            </w:tcBorders>
+            <w:tcMar>
+              <w:top w:type="dxa" w:w="60"/>
+              <w:left w:type="dxa" w:w="100"/>
+              <w:bottom w:type="dxa" w:w="60"/>
+              <w:right w:type="dxa" w:w="100"/>
+            </w:tcMar>
+          </w:tcPr>
+          <w:p>
+            <w:pPr>
+              <w:spacing w:after="40"/>
+            </w:pPr>
+            <w:r>
+              <w:rPr>
+                <w:rFonts w:ascii="Calibri" w:cs="Calibri" w:eastAsia="Calibri" w:hAnsi="Calibri"/>
+                <w:sz w:val="20"/>
+                <w:szCs w:val="20"/>
+              </w:rPr>
+              <w:t xml:space="preserve">—</w:t>
+            </w:r>
+          </w:p>
+        </w:tc>
+        <w:tc>
+          <w:tcPr>
+            <w:tcW w:type="dxa" w:w="977"/>
+            <w:tcBorders>
+              <w:top w:val="single" w:color="B7C1CD" w:sz="4"/>
+              <w:left w:val="single" w:color="B7C1CD" w:sz="4"/>
+              <w:bottom w:val="single" w:color="B7C1CD" w:sz="4"/>
+              <w:right w:val="single" w:color="B7C1CD" w:sz="4"/>
+            </w:tcBorders>
+            <w:tcMar>
+              <w:top w:type="dxa" w:w="60"/>
+              <w:left w:type="dxa" w:w="100"/>
+              <w:bottom w:type="dxa" w:w="60"/>
+              <w:right w:type="dxa" w:w="100"/>
+            </w:tcMar>
+          </w:tcPr>
+          <w:p>
+            <w:pPr>
+              <w:spacing w:after="40"/>
+            </w:pPr>
+            <w:r>
+              <w:rPr>
+                <w:rFonts w:ascii="Calibri" w:cs="Calibri" w:eastAsia="Calibri" w:hAnsi="Calibri"/>
+                <w:sz w:val="20"/>
+                <w:szCs w:val="20"/>
+              </w:rPr>
+              <w:t xml:space="preserve">In Progress</w:t>
+            </w:r>
+          </w:p>
+        </w:tc>
+        <w:tc>
+          <w:tcPr>
+            <w:tcW w:type="dxa" w:w="2155"/>
+            <w:tcBorders>
+              <w:top w:val="single" w:color="B7C1CD" w:sz="4"/>
+              <w:left w:val="single" w:color="B7C1CD" w:sz="4"/>
+              <w:bottom w:val="single" w:color="B7C1CD" w:sz="4"/>
+              <w:right w:val="single" w:color="B7C1CD" w:sz="4"/>
+            </w:tcBorders>
+            <w:tcMar>
+              <w:top w:type="dxa" w:w="60"/>
+              <w:left w:type="dxa" w:w="100"/>
+              <w:bottom w:type="dxa" w:w="60"/>
+              <w:right w:type="dxa" w:w="100"/>
+            </w:tcMar>
+          </w:tcPr>
+          <w:p>
+            <w:pPr>
+              <w:spacing w:after="40"/>
+            </w:pPr>
+            <w:r>
+              <w:rPr>
+                <w:rFonts w:ascii="Calibri" w:cs="Calibri" w:eastAsia="Calibri" w:hAnsi="Calibri"/>
+                <w:sz w:val="20"/>
+                <w:szCs w:val="20"/>
+              </w:rPr>
+              <w:t xml:space="preserve">DigitalOcean droplet chosen; Santosh provisions after local testing. TBD — domain?</w:t>
+            </w:r>
+          </w:p>
+        </w:tc>
+      </w:tr>
+      <w:tr>
+        <w:tc>
+          <w:tcPr>
+            <w:tcW w:type="dxa" w:w="732"/>
+            <w:tcBorders>
+              <w:top w:val="single" w:color="B7C1CD" w:sz="4"/>
+              <w:left w:val="single" w:color="B7C1CD" w:sz="4"/>
+              <w:bottom w:val="single" w:color="B7C1CD" w:sz="4"/>
+              <w:right w:val="single" w:color="B7C1CD" w:sz="4"/>
+            </w:tcBorders>
+            <w:shd w:fill="F6F8FA" w:color="auto" w:val="clear"/>
+            <w:tcMar>
+              <w:top w:type="dxa" w:w="60"/>
+              <w:left w:type="dxa" w:w="100"/>
+              <w:bottom w:type="dxa" w:w="60"/>
+              <w:right w:type="dxa" w:w="100"/>
+            </w:tcMar>
+          </w:tcPr>
+          <w:p>
+            <w:pPr>
+              <w:spacing w:after="40"/>
+            </w:pPr>
+            <w:r>
+              <w:rPr>
+                <w:rFonts w:ascii="Calibri" w:cs="Calibri" w:eastAsia="Calibri" w:hAnsi="Calibri"/>
+                <w:sz w:val="20"/>
+                <w:szCs w:val="20"/>
+              </w:rPr>
+              <w:t xml:space="preserve">12</w:t>
+            </w:r>
+          </w:p>
+        </w:tc>
+        <w:tc>
+          <w:tcPr>
+            <w:tcW w:type="dxa" w:w="1074"/>
+            <w:tcBorders>
+              <w:top w:val="single" w:color="B7C1CD" w:sz="4"/>
+              <w:left w:val="single" w:color="B7C1CD" w:sz="4"/>
+              <w:bottom w:val="single" w:color="B7C1CD" w:sz="4"/>
+              <w:right w:val="single" w:color="B7C1CD" w:sz="4"/>
+            </w:tcBorders>
+            <w:shd w:fill="F6F8FA" w:color="auto" w:val="clear"/>
+            <w:tcMar>
+              <w:top w:type="dxa" w:w="60"/>
+              <w:left w:type="dxa" w:w="100"/>
+              <w:bottom w:type="dxa" w:w="60"/>
+              <w:right w:type="dxa" w:w="100"/>
+            </w:tcMar>
+          </w:tcPr>
+          <w:p>
+            <w:pPr>
+              <w:spacing w:after="40"/>
+            </w:pPr>
+            <w:r>
+              <w:rPr>
+                <w:rFonts w:ascii="Calibri" w:cs="Calibri" w:eastAsia="Calibri" w:hAnsi="Calibri"/>
+                <w:sz w:val="20"/>
+                <w:szCs w:val="20"/>
+              </w:rPr>
+              <w:t xml:space="preserve">Deploy</w:t>
+            </w:r>
+          </w:p>
+        </w:tc>
+        <w:tc>
+          <w:tcPr>
+            <w:tcW w:type="dxa" w:w="2247"/>
+            <w:tcBorders>
+              <w:top w:val="single" w:color="B7C1CD" w:sz="4"/>
+              <w:left w:val="single" w:color="B7C1CD" w:sz="4"/>
+              <w:bottom w:val="single" w:color="B7C1CD" w:sz="4"/>
+              <w:right w:val="single" w:color="B7C1CD" w:sz="4"/>
+            </w:tcBorders>
             <w:shd w:fill="F6F8FA" w:color="auto" w:val="clear"/>
             <w:tcMar>
               <w:top w:type="dxa" w:w="60"/>
@@ -32052,7 +32727,7 @@
                 <w:sz w:val="20"/>
                 <w:szCs w:val="20"/>
               </w:rPr>
-              <w:t xml:space="preserve">AI Agent</w:t>
+              <w:t xml:space="preserve">Santosh</w:t>
             </w:r>
           </w:p>
         </w:tc>
@@ -32269,7 +32944,7 @@
                 <w:sz w:val="20"/>
                 <w:szCs w:val="20"/>
               </w:rPr>
-              <w:t xml:space="preserve">Depends on host and DNS</w:t>
+              <w:t xml:space="preserve">Owner changed to Santosh in v2; steps in README &gt; Deploying to a DigitalOcean droplet</w:t>
             </w:r>
           </w:p>
         </w:tc>
@@ -33753,7 +34428,7 @@
                 <w:sz w:val="20"/>
                 <w:szCs w:val="20"/>
               </w:rPr>
-              <w:t xml:space="preserve">Host TBD</w:t>
+              <w:t xml:space="preserve">DigitalOcean droplet; Santosh sets it up</w:t>
             </w:r>
           </w:p>
         </w:tc>
@@ -34222,6 +34897,101 @@
                 <w:szCs w:val="20"/>
               </w:rPr>
               <w:t xml:space="preserve">Initial plan created</w:t>
+            </w:r>
+          </w:p>
+        </w:tc>
+      </w:tr>
+      <w:tr>
+        <w:tc>
+          <w:tcPr>
+            <w:tcW w:type="dxa" w:w="1302"/>
+            <w:tcBorders>
+              <w:top w:val="single" w:color="B7C1CD" w:sz="4"/>
+              <w:left w:val="single" w:color="B7C1CD" w:sz="4"/>
+              <w:bottom w:val="single" w:color="B7C1CD" w:sz="4"/>
+              <w:right w:val="single" w:color="B7C1CD" w:sz="4"/>
+            </w:tcBorders>
+            <w:shd w:fill="F6F8FA" w:color="auto" w:val="clear"/>
+            <w:tcMar>
+              <w:top w:type="dxa" w:w="60"/>
+              <w:left w:type="dxa" w:w="100"/>
+              <w:bottom w:type="dxa" w:w="60"/>
+              <w:right w:type="dxa" w:w="100"/>
+            </w:tcMar>
+          </w:tcPr>
+          <w:p>
+            <w:pPr>
+              <w:spacing w:after="40"/>
+            </w:pPr>
+            <w:r>
+              <w:rPr>
+                <w:rFonts w:ascii="Calibri" w:cs="Calibri" w:eastAsia="Calibri" w:hAnsi="Calibri"/>
+                <w:sz w:val="20"/>
+                <w:szCs w:val="20"/>
+              </w:rPr>
+              <w:t xml:space="preserve">v2</w:t>
+            </w:r>
+          </w:p>
+        </w:tc>
+        <w:tc>
+          <w:tcPr>
+            <w:tcW w:type="dxa" w:w="1954"/>
+            <w:tcBorders>
+              <w:top w:val="single" w:color="B7C1CD" w:sz="4"/>
+              <w:left w:val="single" w:color="B7C1CD" w:sz="4"/>
+              <w:bottom w:val="single" w:color="B7C1CD" w:sz="4"/>
+              <w:right w:val="single" w:color="B7C1CD" w:sz="4"/>
+            </w:tcBorders>
+            <w:shd w:fill="F6F8FA" w:color="auto" w:val="clear"/>
+            <w:tcMar>
+              <w:top w:type="dxa" w:w="60"/>
+              <w:left w:type="dxa" w:w="100"/>
+              <w:bottom w:type="dxa" w:w="60"/>
+              <w:right w:type="dxa" w:w="100"/>
+            </w:tcMar>
+          </w:tcPr>
+          <w:p>
+            <w:pPr>
+              <w:spacing w:after="40"/>
+            </w:pPr>
+            <w:r>
+              <w:rPr>
+                <w:rFonts w:ascii="Calibri" w:cs="Calibri" w:eastAsia="Calibri" w:hAnsi="Calibri"/>
+                <w:sz w:val="20"/>
+                <w:szCs w:val="20"/>
+              </w:rPr>
+              <w:t xml:space="preserve">2026-10-20</w:t>
+            </w:r>
+          </w:p>
+        </w:tc>
+        <w:tc>
+          <w:tcPr>
+            <w:tcW w:type="dxa" w:w="10424"/>
+            <w:tcBorders>
+              <w:top w:val="single" w:color="B7C1CD" w:sz="4"/>
+              <w:left w:val="single" w:color="B7C1CD" w:sz="4"/>
+              <w:bottom w:val="single" w:color="B7C1CD" w:sz="4"/>
+              <w:right w:val="single" w:color="B7C1CD" w:sz="4"/>
+            </w:tcBorders>
+            <w:shd w:fill="F6F8FA" w:color="auto" w:val="clear"/>
+            <w:tcMar>
+              <w:top w:type="dxa" w:w="60"/>
+              <w:left w:type="dxa" w:w="100"/>
+              <w:bottom w:type="dxa" w:w="60"/>
+              <w:right w:type="dxa" w:w="100"/>
+            </w:tcMar>
+          </w:tcPr>
+          <w:p>
+            <w:pPr>
+              <w:spacing w:after="40"/>
+            </w:pPr>
+            <w:r>
+              <w:rPr>
+                <w:rFonts w:ascii="Calibri" w:cs="Calibri" w:eastAsia="Calibri" w:hAnsi="Calibri"/>
+                <w:sz w:val="20"/>
+                <w:szCs w:val="20"/>
+              </w:rPr>
+              <w:t xml:space="preserve">Confirmed Gmail sign-in addresses and kept default thresholds (Done); chose DigitalOcean with Santosh owning deploy; added local Docker start (Done) and local testing (Not Started).</w:t>
             </w:r>
           </w:p>
         </w:tc>

</xml_diff>